<commit_message>
adding more notes about ai agents, vector dbs.
</commit_message>
<xml_diff>
--- a/Azure/Azure notes.docx
+++ b/Azure/Azure notes.docx
@@ -5,137 +5,41 @@
     <w:p>
       <w:pPr>
         <w:pStyle w:val="Heading1"/>
-        <w:rPr>
-          <w:lang w:val="pl-PL"/>
-        </w:rPr>
       </w:pPr>
       <w:r>
-        <w:rPr>
-          <w:lang w:val="pl-PL"/>
-        </w:rPr>
-        <w:t>Azure CLI</w:t>
+        <w:t>Service Principal</w:t>
+      </w:r>
+    </w:p>
+    <w:p>
+      <w:r>
+        <w:t xml:space="preserve">We can </w:t>
+      </w:r>
+      <w:r>
+        <w:t>use a Service Principal for authentication. We can assign to a Service Principal a role and scope for specific resources.</w:t>
+      </w:r>
+    </w:p>
+    <w:p>
+      <w:r>
+        <w:t>Then we can use this Service Principal’s credentials in our applications to authenticate when using those resources.</w:t>
+      </w:r>
+    </w:p>
+    <w:p>
+      <w:r>
+        <w:t>For example we might have a Service Principal with a scope for ACR allowing for pushing Docker images there.</w:t>
+      </w:r>
+    </w:p>
+    <w:p>
+      <w:r>
+        <w:t>Service Principal has assigned a client (app) ID and password.</w:t>
       </w:r>
     </w:p>
     <w:p>
       <w:pPr>
-        <w:pStyle w:val="Heading2"/>
-        <w:rPr>
-          <w:lang w:val="pl-PL"/>
-        </w:rPr>
+        <w:pStyle w:val="Heading1"/>
       </w:pPr>
       <w:r>
-        <w:rPr>
-          <w:lang w:val="pl-PL"/>
-        </w:rPr>
-        <w:t>Logging in</w:t>
+        <w:t>Azure CLI</w:t>
       </w:r>
-    </w:p>
-    <w:p>
-      <w:pPr>
-        <w:pStyle w:val="ListParagraph"/>
-        <w:numPr>
-          <w:ilvl w:val="0"/>
-          <w:numId w:val="1"/>
-        </w:numPr>
-        <w:rPr>
-          <w:sz w:val="24"/>
-          <w:szCs w:val="24"/>
-        </w:rPr>
-      </w:pPr>
-      <w:r>
-        <w:rPr>
-          <w:sz w:val="24"/>
-          <w:szCs w:val="24"/>
-        </w:rPr>
-        <w:t xml:space="preserve">Logging in </w:t>
-      </w:r>
-      <w:r>
-        <w:rPr>
-          <w:sz w:val="24"/>
-          <w:szCs w:val="24"/>
-        </w:rPr>
-        <w:t>with azure cli: az login</w:t>
-      </w:r>
-    </w:p>
-    <w:p>
-      <w:pPr>
-        <w:pStyle w:val="ListParagraph"/>
-        <w:numPr>
-          <w:ilvl w:val="0"/>
-          <w:numId w:val="1"/>
-        </w:numPr>
-        <w:rPr>
-          <w:sz w:val="24"/>
-          <w:szCs w:val="24"/>
-        </w:rPr>
-      </w:pPr>
-      <w:r>
-        <w:rPr>
-          <w:sz w:val="24"/>
-          <w:szCs w:val="24"/>
-        </w:rPr>
-        <w:t>If looging in using ‘az login’ doesn’t work then I can do this:</w:t>
-      </w:r>
-    </w:p>
-    <w:p>
-      <w:pPr>
-        <w:tabs>
-          <w:tab w:val="left" w:pos="420"/>
-        </w:tabs>
-        <w:rPr>
-          <w:sz w:val="24"/>
-          <w:szCs w:val="24"/>
-        </w:rPr>
-      </w:pPr>
-      <w:r>
-        <w:rPr>
-          <w:noProof/>
-          <w:sz w:val="24"/>
-          <w:szCs w:val="24"/>
-        </w:rPr>
-        <w:drawing>
-          <wp:inline distT="0" distB="0" distL="0" distR="0" wp14:anchorId="397DFF04" wp14:editId="31AD0CA1">
-            <wp:extent cx="3724795" cy="628738"/>
-            <wp:effectExtent l="0" t="0" r="0" b="0"/>
-            <wp:docPr id="1354661345" name="Picture 1" descr="A black background with blue and white text&#10;&#10;AI-generated content may be incorrect."/>
-            <wp:cNvGraphicFramePr>
-              <a:graphicFrameLocks xmlns:a="http://schemas.openxmlformats.org/drawingml/2006/main" noChangeAspect="1"/>
-            </wp:cNvGraphicFramePr>
-            <a:graphic xmlns:a="http://schemas.openxmlformats.org/drawingml/2006/main">
-              <a:graphicData uri="http://schemas.openxmlformats.org/drawingml/2006/picture">
-                <pic:pic xmlns:pic="http://schemas.openxmlformats.org/drawingml/2006/picture">
-                  <pic:nvPicPr>
-                    <pic:cNvPr id="1354661345" name="Picture 1" descr="A black background with blue and white text&#10;&#10;AI-generated content may be incorrect."/>
-                    <pic:cNvPicPr/>
-                  </pic:nvPicPr>
-                  <pic:blipFill>
-                    <a:blip r:embed="rId5"/>
-                    <a:stretch>
-                      <a:fillRect/>
-                    </a:stretch>
-                  </pic:blipFill>
-                  <pic:spPr>
-                    <a:xfrm>
-                      <a:off x="0" y="0"/>
-                      <a:ext cx="3724795" cy="628738"/>
-                    </a:xfrm>
-                    <a:prstGeom prst="rect">
-                      <a:avLst/>
-                    </a:prstGeom>
-                  </pic:spPr>
-                </pic:pic>
-              </a:graphicData>
-            </a:graphic>
-          </wp:inline>
-        </w:drawing>
-      </w:r>
-    </w:p>
-    <w:p>
-      <w:pPr>
-        <w:rPr>
-          <w:lang w:val="pl-PL"/>
-        </w:rPr>
-      </w:pPr>
     </w:p>
     <w:p>
       <w:pPr>
@@ -153,51 +57,16 @@
     </w:p>
     <w:p>
       <w:pPr>
-        <w:numPr>
-          <w:ilvl w:val="0"/>
-          <w:numId w:val="2"/>
-        </w:numPr>
+        <w:spacing w:after="0" w:line="240" w:lineRule="auto"/>
         <w:rPr>
-          <w:sz w:val="24"/>
-          <w:szCs w:val="24"/>
           <w:lang w:val="pl-PL"/>
         </w:rPr>
       </w:pPr>
       <w:r>
         <w:rPr>
-          <w:sz w:val="24"/>
-          <w:szCs w:val="24"/>
           <w:lang w:val="pl-PL"/>
         </w:rPr>
         <w:t>When installing cli using winget it is downloading an installer in the C:\Users\mbulk\AppData\Local\Temp\WinGet\Microsoft.AzureCLI.2.71.0. I need to go there and click on it in order to install it. I think that it will be easier to use another option for installing.</w:t>
-      </w:r>
-    </w:p>
-    <w:p>
-      <w:pPr>
-        <w:pStyle w:val="Heading1"/>
-      </w:pPr>
-      <w:r>
-        <w:t>Service principal</w:t>
-      </w:r>
-    </w:p>
-    <w:p>
-      <w:pPr>
-        <w:pStyle w:val="ListParagraph"/>
-        <w:numPr>
-          <w:ilvl w:val="0"/>
-          <w:numId w:val="1"/>
-        </w:numPr>
-        <w:rPr>
-          <w:sz w:val="24"/>
-          <w:szCs w:val="24"/>
-        </w:rPr>
-      </w:pPr>
-      <w:r>
-        <w:rPr>
-          <w:sz w:val="24"/>
-          <w:szCs w:val="24"/>
-        </w:rPr>
-        <w:t>If I create a Service Principal without providing its name then it gets assigned the defaul name of format ‘azure-cli-yyyy-mm-dd’ where yyyy-mm-dd is date of creation.</w:t>
       </w:r>
     </w:p>
     <w:p/>
@@ -214,146 +83,6 @@
 <file path=word/numbering.xml><?xml version="1.0" encoding="utf-8"?>
 <w:numbering xmlns:wpc="http://schemas.microsoft.com/office/word/2010/wordprocessingCanvas" xmlns:cx="http://schemas.microsoft.com/office/drawing/2014/chartex" xmlns:cx1="http://schemas.microsoft.com/office/drawing/2015/9/8/chartex" xmlns:cx2="http://schemas.microsoft.com/office/drawing/2015/10/21/chartex" xmlns:cx3="http://schemas.microsoft.com/office/drawing/2016/5/9/chartex" xmlns:cx4="http://schemas.microsoft.com/office/drawing/2016/5/10/chartex" xmlns:cx5="http://schemas.microsoft.com/office/drawing/2016/5/11/chartex" xmlns:cx6="http://schemas.microsoft.com/office/drawing/2016/5/12/chartex" xmlns:cx7="http://schemas.microsoft.com/office/drawing/2016/5/13/chartex" xmlns:cx8="http://schemas.microsoft.com/office/drawing/2016/5/14/chartex" xmlns:mc="http://schemas.openxmlformats.org/markup-compatibility/2006" xmlns:aink="http://schemas.microsoft.com/office/drawing/2016/ink" xmlns:am3d="http://schemas.microsoft.com/office/drawing/2017/model3d" xmlns:o="urn:schemas-microsoft-com:office:office" xmlns:oel="http://schemas.microsoft.com/office/2019/extlst" xmlns:r="http://schemas.openxmlformats.org/officeDocument/2006/relationships" xmlns:m="http://schemas.openxmlformats.org/officeDocument/2006/math" xmlns:v="urn:schemas-microsoft-com:vml" xmlns:wp14="http://schemas.microsoft.com/office/word/2010/wordprocessingDrawing" xmlns:wp="http://schemas.openxmlformats.org/drawingml/2006/wordprocessingDrawing" xmlns:w10="urn:schemas-microsoft-com:office:word" xmlns:w="http://schemas.openxmlformats.org/wordprocessingml/2006/main" xmlns:w14="http://schemas.microsoft.com/office/word/2010/wordml" xmlns:w15="http://schemas.microsoft.com/office/word/2012/wordml" xmlns:w16cex="http://schemas.microsoft.com/office/word/2018/wordml/cex" xmlns:w16cid="http://schemas.microsoft.com/office/word/2016/wordml/cid" xmlns:w16="http://schemas.microsoft.com/office/word/2018/wordml" xmlns:w16du="http://schemas.microsoft.com/office/word/2023/wordml/word16du" xmlns:w16sdtdh="http://schemas.microsoft.com/office/word/2020/wordml/sdtdatahash" xmlns:w16sdtfl="http://schemas.microsoft.com/office/word/2024/wordml/sdtformatlock" xmlns:w16se="http://schemas.microsoft.com/office/word/2015/wordml/symex" xmlns:wpg="http://schemas.microsoft.com/office/word/2010/wordprocessingGroup" xmlns:wpi="http://schemas.microsoft.com/office/word/2010/wordprocessingInk" xmlns:wne="http://schemas.microsoft.com/office/word/2006/wordml" xmlns:wps="http://schemas.microsoft.com/office/word/2010/wordprocessingShape" mc:Ignorable="w14 w15 w16se w16cid w16 w16cex w16sdtdh w16sdtfl w16du wp14">
   <w:abstractNum w:abstractNumId="0" w15:restartNumberingAfterBreak="0">
-    <w:nsid w:val="411673C5"/>
-    <w:multiLevelType w:val="multilevel"/>
-    <w:tmpl w:val="411673C5"/>
-    <w:lvl w:ilvl="0">
-      <w:start w:val="1"/>
-      <w:numFmt w:val="bullet"/>
-      <w:lvlText w:val=""/>
-      <w:lvlJc w:val="left"/>
-      <w:pPr>
-        <w:tabs>
-          <w:tab w:val="left" w:pos="420"/>
-        </w:tabs>
-        <w:ind w:left="420" w:hanging="420"/>
-      </w:pPr>
-      <w:rPr>
-        <w:rFonts w:ascii="Wingdings" w:hAnsi="Wingdings" w:hint="default"/>
-      </w:rPr>
-    </w:lvl>
-    <w:lvl w:ilvl="1">
-      <w:start w:val="1"/>
-      <w:numFmt w:val="bullet"/>
-      <w:lvlText w:val=""/>
-      <w:lvlJc w:val="left"/>
-      <w:pPr>
-        <w:tabs>
-          <w:tab w:val="left" w:pos="840"/>
-        </w:tabs>
-        <w:ind w:left="840" w:hanging="420"/>
-      </w:pPr>
-      <w:rPr>
-        <w:rFonts w:ascii="Wingdings" w:hAnsi="Wingdings" w:hint="default"/>
-      </w:rPr>
-    </w:lvl>
-    <w:lvl w:ilvl="2">
-      <w:start w:val="1"/>
-      <w:numFmt w:val="bullet"/>
-      <w:lvlText w:val=""/>
-      <w:lvlJc w:val="left"/>
-      <w:pPr>
-        <w:tabs>
-          <w:tab w:val="left" w:pos="1260"/>
-        </w:tabs>
-        <w:ind w:left="1260" w:hanging="420"/>
-      </w:pPr>
-      <w:rPr>
-        <w:rFonts w:ascii="Wingdings" w:hAnsi="Wingdings" w:hint="default"/>
-      </w:rPr>
-    </w:lvl>
-    <w:lvl w:ilvl="3">
-      <w:start w:val="1"/>
-      <w:numFmt w:val="bullet"/>
-      <w:lvlText w:val=""/>
-      <w:lvlJc w:val="left"/>
-      <w:pPr>
-        <w:tabs>
-          <w:tab w:val="left" w:pos="1680"/>
-        </w:tabs>
-        <w:ind w:left="1680" w:hanging="420"/>
-      </w:pPr>
-      <w:rPr>
-        <w:rFonts w:ascii="Wingdings" w:hAnsi="Wingdings" w:hint="default"/>
-      </w:rPr>
-    </w:lvl>
-    <w:lvl w:ilvl="4">
-      <w:start w:val="1"/>
-      <w:numFmt w:val="bullet"/>
-      <w:lvlText w:val=""/>
-      <w:lvlJc w:val="left"/>
-      <w:pPr>
-        <w:tabs>
-          <w:tab w:val="left" w:pos="2100"/>
-        </w:tabs>
-        <w:ind w:left="2100" w:hanging="420"/>
-      </w:pPr>
-      <w:rPr>
-        <w:rFonts w:ascii="Wingdings" w:hAnsi="Wingdings" w:hint="default"/>
-      </w:rPr>
-    </w:lvl>
-    <w:lvl w:ilvl="5">
-      <w:start w:val="1"/>
-      <w:numFmt w:val="bullet"/>
-      <w:lvlText w:val=""/>
-      <w:lvlJc w:val="left"/>
-      <w:pPr>
-        <w:tabs>
-          <w:tab w:val="left" w:pos="2520"/>
-        </w:tabs>
-        <w:ind w:left="2520" w:hanging="420"/>
-      </w:pPr>
-      <w:rPr>
-        <w:rFonts w:ascii="Wingdings" w:hAnsi="Wingdings" w:hint="default"/>
-      </w:rPr>
-    </w:lvl>
-    <w:lvl w:ilvl="6">
-      <w:start w:val="1"/>
-      <w:numFmt w:val="bullet"/>
-      <w:lvlText w:val=""/>
-      <w:lvlJc w:val="left"/>
-      <w:pPr>
-        <w:tabs>
-          <w:tab w:val="left" w:pos="2940"/>
-        </w:tabs>
-        <w:ind w:left="2940" w:hanging="420"/>
-      </w:pPr>
-      <w:rPr>
-        <w:rFonts w:ascii="Wingdings" w:hAnsi="Wingdings" w:hint="default"/>
-      </w:rPr>
-    </w:lvl>
-    <w:lvl w:ilvl="7">
-      <w:start w:val="1"/>
-      <w:numFmt w:val="bullet"/>
-      <w:lvlText w:val=""/>
-      <w:lvlJc w:val="left"/>
-      <w:pPr>
-        <w:tabs>
-          <w:tab w:val="left" w:pos="3360"/>
-        </w:tabs>
-        <w:ind w:left="3360" w:hanging="420"/>
-      </w:pPr>
-      <w:rPr>
-        <w:rFonts w:ascii="Wingdings" w:hAnsi="Wingdings" w:hint="default"/>
-      </w:rPr>
-    </w:lvl>
-    <w:lvl w:ilvl="8">
-      <w:start w:val="1"/>
-      <w:numFmt w:val="bullet"/>
-      <w:lvlText w:val=""/>
-      <w:lvlJc w:val="left"/>
-      <w:pPr>
-        <w:tabs>
-          <w:tab w:val="left" w:pos="3780"/>
-        </w:tabs>
-        <w:ind w:left="3780" w:hanging="420"/>
-      </w:pPr>
-      <w:rPr>
-        <w:rFonts w:ascii="Wingdings" w:hAnsi="Wingdings" w:hint="default"/>
-      </w:rPr>
-    </w:lvl>
-  </w:abstractNum>
-  <w:abstractNum w:abstractNumId="1" w15:restartNumberingAfterBreak="0">
     <w:nsid w:val="5D5FEA58"/>
     <w:multiLevelType w:val="singleLevel"/>
     <w:tmpl w:val="5D5FEA58"/>
@@ -373,10 +102,123 @@
       </w:rPr>
     </w:lvl>
   </w:abstractNum>
-  <w:num w:numId="1" w16cid:durableId="2092697432">
+  <w:abstractNum w:abstractNumId="1" w15:restartNumberingAfterBreak="0">
+    <w:nsid w:val="7E8B6A9C"/>
+    <w:multiLevelType w:val="hybridMultilevel"/>
+    <w:tmpl w:val="5FF24482"/>
+    <w:lvl w:ilvl="0" w:tplc="04090001">
+      <w:start w:val="1"/>
+      <w:numFmt w:val="bullet"/>
+      <w:lvlText w:val=""/>
+      <w:lvlJc w:val="left"/>
+      <w:pPr>
+        <w:ind w:left="720" w:hanging="360"/>
+      </w:pPr>
+      <w:rPr>
+        <w:rFonts w:ascii="Symbol" w:hAnsi="Symbol" w:hint="default"/>
+      </w:rPr>
+    </w:lvl>
+    <w:lvl w:ilvl="1" w:tplc="04090003" w:tentative="1">
+      <w:start w:val="1"/>
+      <w:numFmt w:val="bullet"/>
+      <w:lvlText w:val="o"/>
+      <w:lvlJc w:val="left"/>
+      <w:pPr>
+        <w:ind w:left="1440" w:hanging="360"/>
+      </w:pPr>
+      <w:rPr>
+        <w:rFonts w:ascii="Courier New" w:hAnsi="Courier New" w:cs="Courier New" w:hint="default"/>
+      </w:rPr>
+    </w:lvl>
+    <w:lvl w:ilvl="2" w:tplc="04090005" w:tentative="1">
+      <w:start w:val="1"/>
+      <w:numFmt w:val="bullet"/>
+      <w:lvlText w:val=""/>
+      <w:lvlJc w:val="left"/>
+      <w:pPr>
+        <w:ind w:left="2160" w:hanging="360"/>
+      </w:pPr>
+      <w:rPr>
+        <w:rFonts w:ascii="Wingdings" w:hAnsi="Wingdings" w:hint="default"/>
+      </w:rPr>
+    </w:lvl>
+    <w:lvl w:ilvl="3" w:tplc="04090001" w:tentative="1">
+      <w:start w:val="1"/>
+      <w:numFmt w:val="bullet"/>
+      <w:lvlText w:val=""/>
+      <w:lvlJc w:val="left"/>
+      <w:pPr>
+        <w:ind w:left="2880" w:hanging="360"/>
+      </w:pPr>
+      <w:rPr>
+        <w:rFonts w:ascii="Symbol" w:hAnsi="Symbol" w:hint="default"/>
+      </w:rPr>
+    </w:lvl>
+    <w:lvl w:ilvl="4" w:tplc="04090003" w:tentative="1">
+      <w:start w:val="1"/>
+      <w:numFmt w:val="bullet"/>
+      <w:lvlText w:val="o"/>
+      <w:lvlJc w:val="left"/>
+      <w:pPr>
+        <w:ind w:left="3600" w:hanging="360"/>
+      </w:pPr>
+      <w:rPr>
+        <w:rFonts w:ascii="Courier New" w:hAnsi="Courier New" w:cs="Courier New" w:hint="default"/>
+      </w:rPr>
+    </w:lvl>
+    <w:lvl w:ilvl="5" w:tplc="04090005" w:tentative="1">
+      <w:start w:val="1"/>
+      <w:numFmt w:val="bullet"/>
+      <w:lvlText w:val=""/>
+      <w:lvlJc w:val="left"/>
+      <w:pPr>
+        <w:ind w:left="4320" w:hanging="360"/>
+      </w:pPr>
+      <w:rPr>
+        <w:rFonts w:ascii="Wingdings" w:hAnsi="Wingdings" w:hint="default"/>
+      </w:rPr>
+    </w:lvl>
+    <w:lvl w:ilvl="6" w:tplc="04090001" w:tentative="1">
+      <w:start w:val="1"/>
+      <w:numFmt w:val="bullet"/>
+      <w:lvlText w:val=""/>
+      <w:lvlJc w:val="left"/>
+      <w:pPr>
+        <w:ind w:left="5040" w:hanging="360"/>
+      </w:pPr>
+      <w:rPr>
+        <w:rFonts w:ascii="Symbol" w:hAnsi="Symbol" w:hint="default"/>
+      </w:rPr>
+    </w:lvl>
+    <w:lvl w:ilvl="7" w:tplc="04090003" w:tentative="1">
+      <w:start w:val="1"/>
+      <w:numFmt w:val="bullet"/>
+      <w:lvlText w:val="o"/>
+      <w:lvlJc w:val="left"/>
+      <w:pPr>
+        <w:ind w:left="5760" w:hanging="360"/>
+      </w:pPr>
+      <w:rPr>
+        <w:rFonts w:ascii="Courier New" w:hAnsi="Courier New" w:cs="Courier New" w:hint="default"/>
+      </w:rPr>
+    </w:lvl>
+    <w:lvl w:ilvl="8" w:tplc="04090005" w:tentative="1">
+      <w:start w:val="1"/>
+      <w:numFmt w:val="bullet"/>
+      <w:lvlText w:val=""/>
+      <w:lvlJc w:val="left"/>
+      <w:pPr>
+        <w:ind w:left="6480" w:hanging="360"/>
+      </w:pPr>
+      <w:rPr>
+        <w:rFonts w:ascii="Wingdings" w:hAnsi="Wingdings" w:hint="default"/>
+      </w:rPr>
+    </w:lvl>
+  </w:abstractNum>
+  <w:num w:numId="1" w16cid:durableId="1669357249">
     <w:abstractNumId w:val="0"/>
   </w:num>
-  <w:num w:numId="2" w16cid:durableId="1669357249">
+  <w:num w:numId="2" w16cid:durableId="380787827">
     <w:abstractNumId w:val="1"/>
   </w:num>
 </w:numbering>
@@ -403,8 +245,8 @@
   </w:docDefaults>
   <w:latentStyles w:defLockedState="0" w:defUIPriority="99" w:defSemiHidden="0" w:defUnhideWhenUsed="0" w:defQFormat="0" w:count="376">
     <w:lsdException w:name="Normal" w:uiPriority="0" w:qFormat="1"/>
-    <w:lsdException w:name="heading 1" w:uiPriority="0" w:qFormat="1"/>
-    <w:lsdException w:name="heading 2" w:semiHidden="1" w:uiPriority="0" w:unhideWhenUsed="1" w:qFormat="1"/>
+    <w:lsdException w:name="heading 1" w:uiPriority="9" w:qFormat="1"/>
+    <w:lsdException w:name="heading 2" w:semiHidden="1" w:uiPriority="9" w:unhideWhenUsed="1" w:qFormat="1"/>
     <w:lsdException w:name="heading 3" w:semiHidden="1" w:uiPriority="9" w:unhideWhenUsed="1" w:qFormat="1"/>
     <w:lsdException w:name="heading 4" w:semiHidden="1" w:uiPriority="9" w:unhideWhenUsed="1" w:qFormat="1"/>
     <w:lsdException w:name="heading 5" w:semiHidden="1" w:uiPriority="9" w:unhideWhenUsed="1" w:qFormat="1"/>
@@ -782,26 +624,15 @@
   <w:style w:type="paragraph" w:default="1" w:styleId="Normal">
     <w:name w:val="Normal"/>
     <w:qFormat/>
-    <w:rsid w:val="00CE0484"/>
-    <w:pPr>
-      <w:spacing w:after="0" w:line="240" w:lineRule="auto"/>
-    </w:pPr>
-    <w:rPr>
-      <w:rFonts w:eastAsiaTheme="minorEastAsia"/>
-      <w:kern w:val="0"/>
-      <w:sz w:val="20"/>
-      <w:szCs w:val="20"/>
-      <w:lang w:eastAsia="zh-CN"/>
-      <w14:ligatures w14:val="none"/>
-    </w:rPr>
   </w:style>
   <w:style w:type="paragraph" w:styleId="Heading1">
     <w:name w:val="heading 1"/>
     <w:basedOn w:val="Normal"/>
     <w:next w:val="Normal"/>
     <w:link w:val="Heading1Char"/>
-    <w:qFormat/>
-    <w:rsid w:val="008466C2"/>
+    <w:uiPriority w:val="9"/>
+    <w:qFormat/>
+    <w:rsid w:val="005314BC"/>
     <w:pPr>
       <w:keepNext/>
       <w:keepLines/>
@@ -820,9 +651,10 @@
     <w:basedOn w:val="Normal"/>
     <w:next w:val="Normal"/>
     <w:link w:val="Heading2Char"/>
+    <w:uiPriority w:val="9"/>
     <w:unhideWhenUsed/>
     <w:qFormat/>
-    <w:rsid w:val="008466C2"/>
+    <w:rsid w:val="005314BC"/>
     <w:pPr>
       <w:keepNext/>
       <w:keepLines/>
@@ -845,7 +677,7 @@
     <w:semiHidden/>
     <w:unhideWhenUsed/>
     <w:qFormat/>
-    <w:rsid w:val="008466C2"/>
+    <w:rsid w:val="005314BC"/>
     <w:pPr>
       <w:keepNext/>
       <w:keepLines/>
@@ -868,7 +700,7 @@
     <w:semiHidden/>
     <w:unhideWhenUsed/>
     <w:qFormat/>
-    <w:rsid w:val="008466C2"/>
+    <w:rsid w:val="005314BC"/>
     <w:pPr>
       <w:keepNext/>
       <w:keepLines/>
@@ -891,7 +723,7 @@
     <w:semiHidden/>
     <w:unhideWhenUsed/>
     <w:qFormat/>
-    <w:rsid w:val="008466C2"/>
+    <w:rsid w:val="005314BC"/>
     <w:pPr>
       <w:keepNext/>
       <w:keepLines/>
@@ -912,11 +744,11 @@
     <w:semiHidden/>
     <w:unhideWhenUsed/>
     <w:qFormat/>
-    <w:rsid w:val="008466C2"/>
+    <w:rsid w:val="005314BC"/>
     <w:pPr>
       <w:keepNext/>
       <w:keepLines/>
-      <w:spacing w:before="40"/>
+      <w:spacing w:before="40" w:after="0"/>
       <w:outlineLvl w:val="5"/>
     </w:pPr>
     <w:rPr>
@@ -935,11 +767,11 @@
     <w:semiHidden/>
     <w:unhideWhenUsed/>
     <w:qFormat/>
-    <w:rsid w:val="008466C2"/>
+    <w:rsid w:val="005314BC"/>
     <w:pPr>
       <w:keepNext/>
       <w:keepLines/>
-      <w:spacing w:before="40"/>
+      <w:spacing w:before="40" w:after="0"/>
       <w:outlineLvl w:val="6"/>
     </w:pPr>
     <w:rPr>
@@ -956,10 +788,11 @@
     <w:semiHidden/>
     <w:unhideWhenUsed/>
     <w:qFormat/>
-    <w:rsid w:val="008466C2"/>
+    <w:rsid w:val="005314BC"/>
     <w:pPr>
       <w:keepNext/>
       <w:keepLines/>
+      <w:spacing w:after="0"/>
       <w:outlineLvl w:val="7"/>
     </w:pPr>
     <w:rPr>
@@ -978,10 +811,11 @@
     <w:semiHidden/>
     <w:unhideWhenUsed/>
     <w:qFormat/>
-    <w:rsid w:val="008466C2"/>
+    <w:rsid w:val="005314BC"/>
     <w:pPr>
       <w:keepNext/>
       <w:keepLines/>
+      <w:spacing w:after="0"/>
       <w:outlineLvl w:val="8"/>
     </w:pPr>
     <w:rPr>
@@ -1020,7 +854,8 @@
     <w:name w:val="Heading 1 Char"/>
     <w:basedOn w:val="DefaultParagraphFont"/>
     <w:link w:val="Heading1"/>
-    <w:rsid w:val="008466C2"/>
+    <w:uiPriority w:val="9"/>
+    <w:rsid w:val="005314BC"/>
     <w:rPr>
       <w:rFonts w:asciiTheme="majorHAnsi" w:eastAsiaTheme="majorEastAsia" w:hAnsiTheme="majorHAnsi" w:cstheme="majorBidi"/>
       <w:color w:val="0F4761" w:themeColor="accent1" w:themeShade="BF"/>
@@ -1032,7 +867,8 @@
     <w:name w:val="Heading 2 Char"/>
     <w:basedOn w:val="DefaultParagraphFont"/>
     <w:link w:val="Heading2"/>
-    <w:rsid w:val="008466C2"/>
+    <w:uiPriority w:val="9"/>
+    <w:rsid w:val="005314BC"/>
     <w:rPr>
       <w:rFonts w:asciiTheme="majorHAnsi" w:eastAsiaTheme="majorEastAsia" w:hAnsiTheme="majorHAnsi" w:cstheme="majorBidi"/>
       <w:color w:val="0F4761" w:themeColor="accent1" w:themeShade="BF"/>
@@ -1046,7 +882,7 @@
     <w:link w:val="Heading3"/>
     <w:uiPriority w:val="9"/>
     <w:semiHidden/>
-    <w:rsid w:val="008466C2"/>
+    <w:rsid w:val="005314BC"/>
     <w:rPr>
       <w:rFonts w:eastAsiaTheme="majorEastAsia" w:cstheme="majorBidi"/>
       <w:color w:val="0F4761" w:themeColor="accent1" w:themeShade="BF"/>
@@ -1060,7 +896,7 @@
     <w:link w:val="Heading4"/>
     <w:uiPriority w:val="9"/>
     <w:semiHidden/>
-    <w:rsid w:val="008466C2"/>
+    <w:rsid w:val="005314BC"/>
     <w:rPr>
       <w:rFonts w:eastAsiaTheme="majorEastAsia" w:cstheme="majorBidi"/>
       <w:i/>
@@ -1074,7 +910,7 @@
     <w:link w:val="Heading5"/>
     <w:uiPriority w:val="9"/>
     <w:semiHidden/>
-    <w:rsid w:val="008466C2"/>
+    <w:rsid w:val="005314BC"/>
     <w:rPr>
       <w:rFonts w:eastAsiaTheme="majorEastAsia" w:cstheme="majorBidi"/>
       <w:color w:val="0F4761" w:themeColor="accent1" w:themeShade="BF"/>
@@ -1086,7 +922,7 @@
     <w:link w:val="Heading6"/>
     <w:uiPriority w:val="9"/>
     <w:semiHidden/>
-    <w:rsid w:val="008466C2"/>
+    <w:rsid w:val="005314BC"/>
     <w:rPr>
       <w:rFonts w:eastAsiaTheme="majorEastAsia" w:cstheme="majorBidi"/>
       <w:i/>
@@ -1100,7 +936,7 @@
     <w:link w:val="Heading7"/>
     <w:uiPriority w:val="9"/>
     <w:semiHidden/>
-    <w:rsid w:val="008466C2"/>
+    <w:rsid w:val="005314BC"/>
     <w:rPr>
       <w:rFonts w:eastAsiaTheme="majorEastAsia" w:cstheme="majorBidi"/>
       <w:color w:val="595959" w:themeColor="text1" w:themeTint="A6"/>
@@ -1112,7 +948,7 @@
     <w:link w:val="Heading8"/>
     <w:uiPriority w:val="9"/>
     <w:semiHidden/>
-    <w:rsid w:val="008466C2"/>
+    <w:rsid w:val="005314BC"/>
     <w:rPr>
       <w:rFonts w:eastAsiaTheme="majorEastAsia" w:cstheme="majorBidi"/>
       <w:i/>
@@ -1126,7 +962,7 @@
     <w:link w:val="Heading9"/>
     <w:uiPriority w:val="9"/>
     <w:semiHidden/>
-    <w:rsid w:val="008466C2"/>
+    <w:rsid w:val="005314BC"/>
     <w:rPr>
       <w:rFonts w:eastAsiaTheme="majorEastAsia" w:cstheme="majorBidi"/>
       <w:color w:val="272727" w:themeColor="text1" w:themeTint="D8"/>
@@ -1139,9 +975,9 @@
     <w:link w:val="TitleChar"/>
     <w:uiPriority w:val="10"/>
     <w:qFormat/>
-    <w:rsid w:val="008466C2"/>
+    <w:rsid w:val="005314BC"/>
     <w:pPr>
-      <w:spacing w:after="80"/>
+      <w:spacing w:after="80" w:line="240" w:lineRule="auto"/>
       <w:contextualSpacing/>
     </w:pPr>
     <w:rPr>
@@ -1157,7 +993,7 @@
     <w:basedOn w:val="DefaultParagraphFont"/>
     <w:link w:val="Title"/>
     <w:uiPriority w:val="10"/>
-    <w:rsid w:val="008466C2"/>
+    <w:rsid w:val="005314BC"/>
     <w:rPr>
       <w:rFonts w:asciiTheme="majorHAnsi" w:eastAsiaTheme="majorEastAsia" w:hAnsiTheme="majorHAnsi" w:cstheme="majorBidi"/>
       <w:spacing w:val="-10"/>
@@ -1173,7 +1009,7 @@
     <w:link w:val="SubtitleChar"/>
     <w:uiPriority w:val="11"/>
     <w:qFormat/>
-    <w:rsid w:val="008466C2"/>
+    <w:rsid w:val="005314BC"/>
     <w:pPr>
       <w:numPr>
         <w:ilvl w:val="1"/>
@@ -1192,7 +1028,7 @@
     <w:basedOn w:val="DefaultParagraphFont"/>
     <w:link w:val="Subtitle"/>
     <w:uiPriority w:val="11"/>
-    <w:rsid w:val="008466C2"/>
+    <w:rsid w:val="005314BC"/>
     <w:rPr>
       <w:rFonts w:eastAsiaTheme="majorEastAsia" w:cstheme="majorBidi"/>
       <w:color w:val="595959" w:themeColor="text1" w:themeTint="A6"/>
@@ -1208,7 +1044,7 @@
     <w:link w:val="QuoteChar"/>
     <w:uiPriority w:val="29"/>
     <w:qFormat/>
-    <w:rsid w:val="008466C2"/>
+    <w:rsid w:val="005314BC"/>
     <w:pPr>
       <w:spacing w:before="160"/>
       <w:jc w:val="center"/>
@@ -1224,7 +1060,7 @@
     <w:basedOn w:val="DefaultParagraphFont"/>
     <w:link w:val="Quote"/>
     <w:uiPriority w:val="29"/>
-    <w:rsid w:val="008466C2"/>
+    <w:rsid w:val="005314BC"/>
     <w:rPr>
       <w:i/>
       <w:iCs/>
@@ -1236,7 +1072,7 @@
     <w:basedOn w:val="Normal"/>
     <w:uiPriority w:val="34"/>
     <w:qFormat/>
-    <w:rsid w:val="008466C2"/>
+    <w:rsid w:val="005314BC"/>
     <w:pPr>
       <w:ind w:left="720"/>
       <w:contextualSpacing/>
@@ -1247,7 +1083,7 @@
     <w:basedOn w:val="DefaultParagraphFont"/>
     <w:uiPriority w:val="21"/>
     <w:qFormat/>
-    <w:rsid w:val="008466C2"/>
+    <w:rsid w:val="005314BC"/>
     <w:rPr>
       <w:i/>
       <w:iCs/>
@@ -1261,7 +1097,7 @@
     <w:link w:val="IntenseQuoteChar"/>
     <w:uiPriority w:val="30"/>
     <w:qFormat/>
-    <w:rsid w:val="008466C2"/>
+    <w:rsid w:val="005314BC"/>
     <w:pPr>
       <w:pBdr>
         <w:top w:val="single" w:sz="4" w:space="10" w:color="0F4761" w:themeColor="accent1" w:themeShade="BF"/>
@@ -1282,7 +1118,7 @@
     <w:basedOn w:val="DefaultParagraphFont"/>
     <w:link w:val="IntenseQuote"/>
     <w:uiPriority w:val="30"/>
-    <w:rsid w:val="008466C2"/>
+    <w:rsid w:val="005314BC"/>
     <w:rPr>
       <w:i/>
       <w:iCs/>
@@ -1294,7 +1130,7 @@
     <w:basedOn w:val="DefaultParagraphFont"/>
     <w:uiPriority w:val="32"/>
     <w:qFormat/>
-    <w:rsid w:val="008466C2"/>
+    <w:rsid w:val="005314BC"/>
     <w:rPr>
       <w:b/>
       <w:bCs/>

</xml_diff>